<commit_message>
Hand-in is now a reply under the Teams announcement post
Students reply to the lab's announcement post in the class channel
instead of sending a direct message, so all reports sit in one thread.
Updated the hero and course blurb, the key facts, the step 9 wording and
checklist, the stuck-help line and the Word template. The Teams
walkthrough is redrawn as a channel: find the post, click Reply, attach
the PDF from the device, add a line, send, and see it sit under the post.

Co-Authored-By: Claude Sonnet 5.5 <noreply@anthropic.com>
Claude-Session: https://claude.ai/code/session_017EkUiNUCcCBsgECBMy4rjN
</commit_message>
<xml_diff>
--- a/public/mbi806b/linear-regression/MBI806B-linear-regression-report-template.docx
+++ b/public/mbi806b/linear-regression/MBI806B-linear-regression-report-template.docx
@@ -146,7 +146,7 @@
           <w:sz w:val="20"/>
           <w:szCs w:val="20"/>
         </w:rPr>
-        <w:t xml:space="preserve">Delete the grey writing as you go and replace it with your own. Aim for 600 to 1,000 words, plus your screenshots. Every number in here should come from your own notebook, not from the lesson page. When you are done, save it as a PDF and send it to me in a Teams chat.</w:t>
+        <w:t xml:space="preserve">Delete the grey writing as you go and replace it with your own. Aim for 600 to 1,000 words, plus your screenshots. Every number in here should come from your own notebook, not from the lesson page. When you are done, save it as a PDF and post it as a reply to my lab announcement in Teams.</w:t>
       </w:r>
     </w:p>
     <w:p>
@@ -1937,7 +1937,7 @@
           <w:sz w:val="22"/>
           <w:szCs w:val="22"/>
         </w:rPr>
-        <w:t xml:space="preserve">☐  Sent to Yasas in a Teams chat</w:t>
+        <w:t xml:space="preserve">☐  Posted as a reply under the lab announcement post in Teams</w:t>
       </w:r>
     </w:p>
     <w:sectPr>

</xml_diff>